<commit_message>
modified missing records related to birth data set 2000
</commit_message>
<xml_diff>
--- a/notebooks/2000_Birth/01_birth_records_quality_report.docx
+++ b/notebooks/2000_Birth/01_birth_records_quality_report.docx
@@ -13,12 +13,12 @@
     </w:p>
     <w:p>
       <w:r>
-        <w:t>Generated: 2026-04-19 15:22</w:t>
+        <w:t>Generated: 2026-04-24 06:21</w:t>
       </w:r>
     </w:p>
     <w:p>
       <w:r>
-        <w:t>Dataset: 1,048,575 birth records × 14 variables</w:t>
+        <w:t>Dataset: 347,749 birth records × 14 variables</w:t>
       </w:r>
     </w:p>
     <w:p/>
@@ -37,21 +37,21 @@
         <w:t>Key findings include:</w:t>
         <w:br/>
         <w:br/>
-        <w:t>• **Dataset Overview**: 1,048,575 total birth records with 14 variables</w:t>
+        <w:t>• **Dataset Overview**: 347,749 total birth records with 14 variables</w:t>
         <w:br/>
-        <w:t>• **Data Completeness**: 347,437 records (33.1%) are completely filled with no missing values</w:t>
+        <w:t>• **Data Completeness**: 347,437 records (99.9%) are completely filled with no missing values</w:t>
         <w:br/>
-        <w:t>• **Records with Missing Data**: 701,138 records (66.9%) contain at least one missing value</w:t>
+        <w:t>• **Records with Missing Data**: 312 records (0.1%) contain at least one missing value</w:t>
         <w:br/>
-        <w:t>• **Total Missing Values**: 8,410,224 missing values across all variables (57.29% of all data)</w:t>
+        <w:t>• **Total Missing Values**: 312 missing values across all variables (0.01% of all data)</w:t>
         <w:br/>
-        <w:t>• **Average Completeness**: Each record has an average of 8.02 missing values</w:t>
+        <w:t>• **Average Completeness**: Each record has an average of 0.0 missing values</w:t>
         <w:br/>
-        <w:t>• **Maximum Missing**: The record with most missing data has 12 missing values</w:t>
+        <w:t>• **Maximum Missing**: The record with most missing data has 1 missing values</w:t>
         <w:br/>
-        <w:t>• **Variables with Missing Data**: 12 out of 14 variables have missing values</w:t>
+        <w:t>• **Variables with Missing Data**: 2 out of 14 variables have missing values</w:t>
         <w:br/>
-        <w:t>• **Critical Variables**: ['Birth_Order', 'Race_of_Mother', 'Birh_Year_2.0'] have the highest missing rates</w:t>
+        <w:t>• **Critical Variables**: ['Birth_Order', 'Race_of_Mother', 'Registered_District'] have the highest missing rates</w:t>
       </w:r>
     </w:p>
     <w:p>
@@ -127,7 +127,7 @@
               <w:jc w:val="right"/>
             </w:pPr>
             <w:r>
-              <w:t>1048575.0</w:t>
+              <w:t>347749.0</w:t>
             </w:r>
           </w:p>
         </w:tc>
@@ -177,7 +177,7 @@
               <w:jc w:val="right"/>
             </w:pPr>
             <w:r>
-              <w:t>12.0</w:t>
+              <w:t>2.0</w:t>
             </w:r>
           </w:p>
         </w:tc>
@@ -202,7 +202,7 @@
               <w:jc w:val="right"/>
             </w:pPr>
             <w:r>
-              <w:t>8410224.0</w:t>
+              <w:t>312.0</w:t>
             </w:r>
           </w:p>
         </w:tc>
@@ -227,7 +227,7 @@
               <w:jc w:val="right"/>
             </w:pPr>
             <w:r>
-              <w:t>57.29</w:t>
+              <w:t>0.01</w:t>
             </w:r>
           </w:p>
         </w:tc>
@@ -277,7 +277,7 @@
               <w:jc w:val="right"/>
             </w:pPr>
             <w:r>
-              <w:t>701138.0</w:t>
+              <w:t>312.0</w:t>
             </w:r>
           </w:p>
         </w:tc>
@@ -302,7 +302,7 @@
               <w:jc w:val="right"/>
             </w:pPr>
             <w:r>
-              <w:t>33.13</w:t>
+              <w:t>99.91</w:t>
             </w:r>
           </w:p>
         </w:tc>
@@ -327,7 +327,7 @@
               <w:jc w:val="right"/>
             </w:pPr>
             <w:r>
-              <w:t>66.87</w:t>
+              <w:t>0.09</w:t>
             </w:r>
           </w:p>
         </w:tc>
@@ -352,7 +352,7 @@
               <w:jc w:val="right"/>
             </w:pPr>
             <w:r>
-              <w:t>8.02</w:t>
+              <w:t>0.0</w:t>
             </w:r>
           </w:p>
         </w:tc>
@@ -377,7 +377,7 @@
               <w:jc w:val="right"/>
             </w:pPr>
             <w:r>
-              <w:t>12.0</w:t>
+              <w:t>1.0</w:t>
             </w:r>
           </w:p>
         </w:tc>
@@ -393,7 +393,7 @@
     </w:p>
     <w:p>
       <w:r>
-        <w:t>Found 347,437 completely filled birth records (33.1% of total). These records can be used for immediate analysis without imputation.</w:t>
+        <w:t>Found 347,437 completely filled birth records (99.9% of total). These records can be used for immediate analysis without imputation.</w:t>
       </w:r>
     </w:p>
     <w:p>
@@ -411,7 +411,7 @@
     </w:p>
     <w:p>
       <w:r>
-        <w:t>Found 701,138 records with at least one missing value (66.9% of total). These records require data imputation or careful handling in analysis.</w:t>
+        <w:t>Found 312 records with at least one missing value (0.1% of total). These records require data imputation or careful handling in analysis.</w:t>
       </w:r>
     </w:p>
     <w:p>
@@ -680,7 +680,7 @@
               <w:jc w:val="right"/>
             </w:pPr>
             <w:r>
-              <w:t>701,047</w:t>
+              <w:t>221</w:t>
             </w:r>
           </w:p>
         </w:tc>
@@ -693,7 +693,7 @@
               <w:jc w:val="right"/>
             </w:pPr>
             <w:r>
-              <w:t>66.9%</w:t>
+              <w:t>0.1%</w:t>
             </w:r>
           </w:p>
         </w:tc>
@@ -742,7 +742,7 @@
               <w:jc w:val="right"/>
             </w:pPr>
             <w:r>
-              <w:t>33.1%</w:t>
+              <w:t>99.9%</w:t>
             </w:r>
           </w:p>
         </w:tc>
@@ -767,7 +767,7 @@
               <w:jc w:val="right"/>
             </w:pPr>
             <w:r>
-              <w:t>700,917</w:t>
+              <w:t>91</w:t>
             </w:r>
           </w:p>
         </w:tc>
@@ -780,7 +780,7 @@
               <w:jc w:val="right"/>
             </w:pPr>
             <w:r>
-              <w:t>66.8%</w:t>
+              <w:t>0.0%</w:t>
             </w:r>
           </w:p>
         </w:tc>
@@ -829,877 +829,7 @@
               <w:jc w:val="right"/>
             </w:pPr>
             <w:r>
-              <w:t>33.2%</w:t>
-            </w:r>
-          </w:p>
-        </w:tc>
-      </w:tr>
-      <w:tr>
-        <w:tc>
-          <w:tcPr>
-            <w:tcW w:type="dxa" w:w="1234"/>
-          </w:tcPr>
-          <w:p>
-            <w:r>
-              <w:t>Birh_Year_2.0</w:t>
-            </w:r>
-          </w:p>
-        </w:tc>
-        <w:tc>
-          <w:tcPr>
-            <w:tcW w:type="dxa" w:w="1234"/>
-          </w:tcPr>
-          <w:p>
-            <w:pPr>
-              <w:jc w:val="right"/>
-            </w:pPr>
-            <w:r>
-              <w:t>700,826</w:t>
-            </w:r>
-          </w:p>
-        </w:tc>
-        <w:tc>
-          <w:tcPr>
-            <w:tcW w:type="dxa" w:w="1234"/>
-          </w:tcPr>
-          <w:p>
-            <w:pPr>
-              <w:jc w:val="right"/>
-            </w:pPr>
-            <w:r>
-              <w:t>66.8%</w:t>
-            </w:r>
-          </w:p>
-        </w:tc>
-        <w:tc>
-          <w:tcPr>
-            <w:tcW w:type="dxa" w:w="1234"/>
-          </w:tcPr>
-          <w:p>
-            <w:r>
-              <w:t>float64</w:t>
-            </w:r>
-          </w:p>
-        </w:tc>
-        <w:tc>
-          <w:tcPr>
-            <w:tcW w:type="dxa" w:w="1234"/>
-          </w:tcPr>
-          <w:p>
-            <w:pPr>
-              <w:jc w:val="right"/>
-            </w:pPr>
-            <w:r>
-              <w:t>57</w:t>
-            </w:r>
-          </w:p>
-        </w:tc>
-        <w:tc>
-          <w:tcPr>
-            <w:tcW w:type="dxa" w:w="1234"/>
-          </w:tcPr>
-          <w:p>
-            <w:pPr>
-              <w:jc w:val="right"/>
-            </w:pPr>
-            <w:r>
-              <w:t>347,749</w:t>
-            </w:r>
-          </w:p>
-        </w:tc>
-        <w:tc>
-          <w:tcPr>
-            <w:tcW w:type="dxa" w:w="1234"/>
-          </w:tcPr>
-          <w:p>
-            <w:pPr>
-              <w:jc w:val="right"/>
-            </w:pPr>
-            <w:r>
-              <w:t>33.2%</w:t>
-            </w:r>
-          </w:p>
-        </w:tc>
-      </w:tr>
-      <w:tr>
-        <w:tc>
-          <w:tcPr>
-            <w:tcW w:type="dxa" w:w="1234"/>
-          </w:tcPr>
-          <w:p>
-            <w:r>
-              <w:t>Birh_Year</w:t>
-            </w:r>
-          </w:p>
-        </w:tc>
-        <w:tc>
-          <w:tcPr>
-            <w:tcW w:type="dxa" w:w="1234"/>
-          </w:tcPr>
-          <w:p>
-            <w:pPr>
-              <w:jc w:val="right"/>
-            </w:pPr>
-            <w:r>
-              <w:t>700,826</w:t>
-            </w:r>
-          </w:p>
-        </w:tc>
-        <w:tc>
-          <w:tcPr>
-            <w:tcW w:type="dxa" w:w="1234"/>
-          </w:tcPr>
-          <w:p>
-            <w:pPr>
-              <w:jc w:val="right"/>
-            </w:pPr>
-            <w:r>
-              <w:t>66.8%</w:t>
-            </w:r>
-          </w:p>
-        </w:tc>
-        <w:tc>
-          <w:tcPr>
-            <w:tcW w:type="dxa" w:w="1234"/>
-          </w:tcPr>
-          <w:p>
-            <w:r>
-              <w:t>float64</w:t>
-            </w:r>
-          </w:p>
-        </w:tc>
-        <w:tc>
-          <w:tcPr>
-            <w:tcW w:type="dxa" w:w="1234"/>
-          </w:tcPr>
-          <w:p>
-            <w:pPr>
-              <w:jc w:val="right"/>
-            </w:pPr>
-            <w:r>
-              <w:t>57</w:t>
-            </w:r>
-          </w:p>
-        </w:tc>
-        <w:tc>
-          <w:tcPr>
-            <w:tcW w:type="dxa" w:w="1234"/>
-          </w:tcPr>
-          <w:p>
-            <w:pPr>
-              <w:jc w:val="right"/>
-            </w:pPr>
-            <w:r>
-              <w:t>347,749</w:t>
-            </w:r>
-          </w:p>
-        </w:tc>
-        <w:tc>
-          <w:tcPr>
-            <w:tcW w:type="dxa" w:w="1234"/>
-          </w:tcPr>
-          <w:p>
-            <w:pPr>
-              <w:jc w:val="right"/>
-            </w:pPr>
-            <w:r>
-              <w:t>33.2%</w:t>
-            </w:r>
-          </w:p>
-        </w:tc>
-      </w:tr>
-      <w:tr>
-        <w:tc>
-          <w:tcPr>
-            <w:tcW w:type="dxa" w:w="1234"/>
-          </w:tcPr>
-          <w:p>
-            <w:r>
-              <w:t>Registered_Year</w:t>
-            </w:r>
-          </w:p>
-        </w:tc>
-        <w:tc>
-          <w:tcPr>
-            <w:tcW w:type="dxa" w:w="1234"/>
-          </w:tcPr>
-          <w:p>
-            <w:pPr>
-              <w:jc w:val="right"/>
-            </w:pPr>
-            <w:r>
-              <w:t>700,826</w:t>
-            </w:r>
-          </w:p>
-        </w:tc>
-        <w:tc>
-          <w:tcPr>
-            <w:tcW w:type="dxa" w:w="1234"/>
-          </w:tcPr>
-          <w:p>
-            <w:pPr>
-              <w:jc w:val="right"/>
-            </w:pPr>
-            <w:r>
-              <w:t>66.8%</w:t>
-            </w:r>
-          </w:p>
-        </w:tc>
-        <w:tc>
-          <w:tcPr>
-            <w:tcW w:type="dxa" w:w="1234"/>
-          </w:tcPr>
-          <w:p>
-            <w:r>
-              <w:t>float64</w:t>
-            </w:r>
-          </w:p>
-        </w:tc>
-        <w:tc>
-          <w:tcPr>
-            <w:tcW w:type="dxa" w:w="1234"/>
-          </w:tcPr>
-          <w:p>
-            <w:pPr>
-              <w:jc w:val="right"/>
-            </w:pPr>
-            <w:r>
-              <w:t>1</w:t>
-            </w:r>
-          </w:p>
-        </w:tc>
-        <w:tc>
-          <w:tcPr>
-            <w:tcW w:type="dxa" w:w="1234"/>
-          </w:tcPr>
-          <w:p>
-            <w:pPr>
-              <w:jc w:val="right"/>
-            </w:pPr>
-            <w:r>
-              <w:t>347,749</w:t>
-            </w:r>
-          </w:p>
-        </w:tc>
-        <w:tc>
-          <w:tcPr>
-            <w:tcW w:type="dxa" w:w="1234"/>
-          </w:tcPr>
-          <w:p>
-            <w:pPr>
-              <w:jc w:val="right"/>
-            </w:pPr>
-            <w:r>
-              <w:t>33.2%</w:t>
-            </w:r>
-          </w:p>
-        </w:tc>
-      </w:tr>
-      <w:tr>
-        <w:tc>
-          <w:tcPr>
-            <w:tcW w:type="dxa" w:w="1234"/>
-          </w:tcPr>
-          <w:p>
-            <w:r>
-              <w:t>Registered_Month</w:t>
-            </w:r>
-          </w:p>
-        </w:tc>
-        <w:tc>
-          <w:tcPr>
-            <w:tcW w:type="dxa" w:w="1234"/>
-          </w:tcPr>
-          <w:p>
-            <w:pPr>
-              <w:jc w:val="right"/>
-            </w:pPr>
-            <w:r>
-              <w:t>700,826</w:t>
-            </w:r>
-          </w:p>
-        </w:tc>
-        <w:tc>
-          <w:tcPr>
-            <w:tcW w:type="dxa" w:w="1234"/>
-          </w:tcPr>
-          <w:p>
-            <w:pPr>
-              <w:jc w:val="right"/>
-            </w:pPr>
-            <w:r>
-              <w:t>66.8%</w:t>
-            </w:r>
-          </w:p>
-        </w:tc>
-        <w:tc>
-          <w:tcPr>
-            <w:tcW w:type="dxa" w:w="1234"/>
-          </w:tcPr>
-          <w:p>
-            <w:r>
-              <w:t>str</w:t>
-            </w:r>
-          </w:p>
-        </w:tc>
-        <w:tc>
-          <w:tcPr>
-            <w:tcW w:type="dxa" w:w="1234"/>
-          </w:tcPr>
-          <w:p>
-            <w:pPr>
-              <w:jc w:val="right"/>
-            </w:pPr>
-            <w:r>
-              <w:t>12</w:t>
-            </w:r>
-          </w:p>
-        </w:tc>
-        <w:tc>
-          <w:tcPr>
-            <w:tcW w:type="dxa" w:w="1234"/>
-          </w:tcPr>
-          <w:p>
-            <w:pPr>
-              <w:jc w:val="right"/>
-            </w:pPr>
-            <w:r>
-              <w:t>347,749</w:t>
-            </w:r>
-          </w:p>
-        </w:tc>
-        <w:tc>
-          <w:tcPr>
-            <w:tcW w:type="dxa" w:w="1234"/>
-          </w:tcPr>
-          <w:p>
-            <w:pPr>
-              <w:jc w:val="right"/>
-            </w:pPr>
-            <w:r>
-              <w:t>33.2%</w:t>
-            </w:r>
-          </w:p>
-        </w:tc>
-      </w:tr>
-      <w:tr>
-        <w:tc>
-          <w:tcPr>
-            <w:tcW w:type="dxa" w:w="1234"/>
-          </w:tcPr>
-          <w:p>
-            <w:r>
-              <w:t>Birth_Order 2.0</w:t>
-            </w:r>
-          </w:p>
-        </w:tc>
-        <w:tc>
-          <w:tcPr>
-            <w:tcW w:type="dxa" w:w="1234"/>
-          </w:tcPr>
-          <w:p>
-            <w:pPr>
-              <w:jc w:val="right"/>
-            </w:pPr>
-            <w:r>
-              <w:t>700,826</w:t>
-            </w:r>
-          </w:p>
-        </w:tc>
-        <w:tc>
-          <w:tcPr>
-            <w:tcW w:type="dxa" w:w="1234"/>
-          </w:tcPr>
-          <w:p>
-            <w:pPr>
-              <w:jc w:val="right"/>
-            </w:pPr>
-            <w:r>
-              <w:t>66.8%</w:t>
-            </w:r>
-          </w:p>
-        </w:tc>
-        <w:tc>
-          <w:tcPr>
-            <w:tcW w:type="dxa" w:w="1234"/>
-          </w:tcPr>
-          <w:p>
-            <w:r>
-              <w:t>float64</w:t>
-            </w:r>
-          </w:p>
-        </w:tc>
-        <w:tc>
-          <w:tcPr>
-            <w:tcW w:type="dxa" w:w="1234"/>
-          </w:tcPr>
-          <w:p>
-            <w:pPr>
-              <w:jc w:val="right"/>
-            </w:pPr>
-            <w:r>
-              <w:t>14</w:t>
-            </w:r>
-          </w:p>
-        </w:tc>
-        <w:tc>
-          <w:tcPr>
-            <w:tcW w:type="dxa" w:w="1234"/>
-          </w:tcPr>
-          <w:p>
-            <w:pPr>
-              <w:jc w:val="right"/>
-            </w:pPr>
-            <w:r>
-              <w:t>347,749</w:t>
-            </w:r>
-          </w:p>
-        </w:tc>
-        <w:tc>
-          <w:tcPr>
-            <w:tcW w:type="dxa" w:w="1234"/>
-          </w:tcPr>
-          <w:p>
-            <w:pPr>
-              <w:jc w:val="right"/>
-            </w:pPr>
-            <w:r>
-              <w:t>33.2%</w:t>
-            </w:r>
-          </w:p>
-        </w:tc>
-      </w:tr>
-      <w:tr>
-        <w:tc>
-          <w:tcPr>
-            <w:tcW w:type="dxa" w:w="1234"/>
-          </w:tcPr>
-          <w:p>
-            <w:r>
-              <w:t>Birth_Month</w:t>
-            </w:r>
-          </w:p>
-        </w:tc>
-        <w:tc>
-          <w:tcPr>
-            <w:tcW w:type="dxa" w:w="1234"/>
-          </w:tcPr>
-          <w:p>
-            <w:pPr>
-              <w:jc w:val="right"/>
-            </w:pPr>
-            <w:r>
-              <w:t>700,826</w:t>
-            </w:r>
-          </w:p>
-        </w:tc>
-        <w:tc>
-          <w:tcPr>
-            <w:tcW w:type="dxa" w:w="1234"/>
-          </w:tcPr>
-          <w:p>
-            <w:pPr>
-              <w:jc w:val="right"/>
-            </w:pPr>
-            <w:r>
-              <w:t>66.8%</w:t>
-            </w:r>
-          </w:p>
-        </w:tc>
-        <w:tc>
-          <w:tcPr>
-            <w:tcW w:type="dxa" w:w="1234"/>
-          </w:tcPr>
-          <w:p>
-            <w:r>
-              <w:t>str</w:t>
-            </w:r>
-          </w:p>
-        </w:tc>
-        <w:tc>
-          <w:tcPr>
-            <w:tcW w:type="dxa" w:w="1234"/>
-          </w:tcPr>
-          <w:p>
-            <w:pPr>
-              <w:jc w:val="right"/>
-            </w:pPr>
-            <w:r>
-              <w:t>12</w:t>
-            </w:r>
-          </w:p>
-        </w:tc>
-        <w:tc>
-          <w:tcPr>
-            <w:tcW w:type="dxa" w:w="1234"/>
-          </w:tcPr>
-          <w:p>
-            <w:pPr>
-              <w:jc w:val="right"/>
-            </w:pPr>
-            <w:r>
-              <w:t>347,749</w:t>
-            </w:r>
-          </w:p>
-        </w:tc>
-        <w:tc>
-          <w:tcPr>
-            <w:tcW w:type="dxa" w:w="1234"/>
-          </w:tcPr>
-          <w:p>
-            <w:pPr>
-              <w:jc w:val="right"/>
-            </w:pPr>
-            <w:r>
-              <w:t>33.2%</w:t>
-            </w:r>
-          </w:p>
-        </w:tc>
-      </w:tr>
-      <w:tr>
-        <w:tc>
-          <w:tcPr>
-            <w:tcW w:type="dxa" w:w="1234"/>
-          </w:tcPr>
-          <w:p>
-            <w:r>
-              <w:t>Hospital or Not</w:t>
-            </w:r>
-          </w:p>
-        </w:tc>
-        <w:tc>
-          <w:tcPr>
-            <w:tcW w:type="dxa" w:w="1234"/>
-          </w:tcPr>
-          <w:p>
-            <w:pPr>
-              <w:jc w:val="right"/>
-            </w:pPr>
-            <w:r>
-              <w:t>700,826</w:t>
-            </w:r>
-          </w:p>
-        </w:tc>
-        <w:tc>
-          <w:tcPr>
-            <w:tcW w:type="dxa" w:w="1234"/>
-          </w:tcPr>
-          <w:p>
-            <w:pPr>
-              <w:jc w:val="right"/>
-            </w:pPr>
-            <w:r>
-              <w:t>66.8%</w:t>
-            </w:r>
-          </w:p>
-        </w:tc>
-        <w:tc>
-          <w:tcPr>
-            <w:tcW w:type="dxa" w:w="1234"/>
-          </w:tcPr>
-          <w:p>
-            <w:r>
-              <w:t>str</w:t>
-            </w:r>
-          </w:p>
-        </w:tc>
-        <w:tc>
-          <w:tcPr>
-            <w:tcW w:type="dxa" w:w="1234"/>
-          </w:tcPr>
-          <w:p>
-            <w:pPr>
-              <w:jc w:val="right"/>
-            </w:pPr>
-            <w:r>
-              <w:t>2</w:t>
-            </w:r>
-          </w:p>
-        </w:tc>
-        <w:tc>
-          <w:tcPr>
-            <w:tcW w:type="dxa" w:w="1234"/>
-          </w:tcPr>
-          <w:p>
-            <w:pPr>
-              <w:jc w:val="right"/>
-            </w:pPr>
-            <w:r>
-              <w:t>347,749</w:t>
-            </w:r>
-          </w:p>
-        </w:tc>
-        <w:tc>
-          <w:tcPr>
-            <w:tcW w:type="dxa" w:w="1234"/>
-          </w:tcPr>
-          <w:p>
-            <w:pPr>
-              <w:jc w:val="right"/>
-            </w:pPr>
-            <w:r>
-              <w:t>33.2%</w:t>
-            </w:r>
-          </w:p>
-        </w:tc>
-      </w:tr>
-      <w:tr>
-        <w:tc>
-          <w:tcPr>
-            <w:tcW w:type="dxa" w:w="1234"/>
-          </w:tcPr>
-          <w:p>
-            <w:r>
-              <w:t>Gender</w:t>
-            </w:r>
-          </w:p>
-        </w:tc>
-        <w:tc>
-          <w:tcPr>
-            <w:tcW w:type="dxa" w:w="1234"/>
-          </w:tcPr>
-          <w:p>
-            <w:pPr>
-              <w:jc w:val="right"/>
-            </w:pPr>
-            <w:r>
-              <w:t>700,826</w:t>
-            </w:r>
-          </w:p>
-        </w:tc>
-        <w:tc>
-          <w:tcPr>
-            <w:tcW w:type="dxa" w:w="1234"/>
-          </w:tcPr>
-          <w:p>
-            <w:pPr>
-              <w:jc w:val="right"/>
-            </w:pPr>
-            <w:r>
-              <w:t>66.8%</w:t>
-            </w:r>
-          </w:p>
-        </w:tc>
-        <w:tc>
-          <w:tcPr>
-            <w:tcW w:type="dxa" w:w="1234"/>
-          </w:tcPr>
-          <w:p>
-            <w:r>
-              <w:t>str</w:t>
-            </w:r>
-          </w:p>
-        </w:tc>
-        <w:tc>
-          <w:tcPr>
-            <w:tcW w:type="dxa" w:w="1234"/>
-          </w:tcPr>
-          <w:p>
-            <w:pPr>
-              <w:jc w:val="right"/>
-            </w:pPr>
-            <w:r>
-              <w:t>2</w:t>
-            </w:r>
-          </w:p>
-        </w:tc>
-        <w:tc>
-          <w:tcPr>
-            <w:tcW w:type="dxa" w:w="1234"/>
-          </w:tcPr>
-          <w:p>
-            <w:pPr>
-              <w:jc w:val="right"/>
-            </w:pPr>
-            <w:r>
-              <w:t>347,749</w:t>
-            </w:r>
-          </w:p>
-        </w:tc>
-        <w:tc>
-          <w:tcPr>
-            <w:tcW w:type="dxa" w:w="1234"/>
-          </w:tcPr>
-          <w:p>
-            <w:pPr>
-              <w:jc w:val="right"/>
-            </w:pPr>
-            <w:r>
-              <w:t>33.2%</w:t>
-            </w:r>
-          </w:p>
-        </w:tc>
-      </w:tr>
-      <w:tr>
-        <w:tc>
-          <w:tcPr>
-            <w:tcW w:type="dxa" w:w="1234"/>
-          </w:tcPr>
-          <w:p>
-            <w:r>
-              <w:t>Marital_Status</w:t>
-            </w:r>
-          </w:p>
-        </w:tc>
-        <w:tc>
-          <w:tcPr>
-            <w:tcW w:type="dxa" w:w="1234"/>
-          </w:tcPr>
-          <w:p>
-            <w:pPr>
-              <w:jc w:val="right"/>
-            </w:pPr>
-            <w:r>
-              <w:t>700,826</w:t>
-            </w:r>
-          </w:p>
-        </w:tc>
-        <w:tc>
-          <w:tcPr>
-            <w:tcW w:type="dxa" w:w="1234"/>
-          </w:tcPr>
-          <w:p>
-            <w:pPr>
-              <w:jc w:val="right"/>
-            </w:pPr>
-            <w:r>
-              <w:t>66.8%</w:t>
-            </w:r>
-          </w:p>
-        </w:tc>
-        <w:tc>
-          <w:tcPr>
-            <w:tcW w:type="dxa" w:w="1234"/>
-          </w:tcPr>
-          <w:p>
-            <w:r>
-              <w:t>str</w:t>
-            </w:r>
-          </w:p>
-        </w:tc>
-        <w:tc>
-          <w:tcPr>
-            <w:tcW w:type="dxa" w:w="1234"/>
-          </w:tcPr>
-          <w:p>
-            <w:pPr>
-              <w:jc w:val="right"/>
-            </w:pPr>
-            <w:r>
-              <w:t>2</w:t>
-            </w:r>
-          </w:p>
-        </w:tc>
-        <w:tc>
-          <w:tcPr>
-            <w:tcW w:type="dxa" w:w="1234"/>
-          </w:tcPr>
-          <w:p>
-            <w:pPr>
-              <w:jc w:val="right"/>
-            </w:pPr>
-            <w:r>
-              <w:t>347,749</w:t>
-            </w:r>
-          </w:p>
-        </w:tc>
-        <w:tc>
-          <w:tcPr>
-            <w:tcW w:type="dxa" w:w="1234"/>
-          </w:tcPr>
-          <w:p>
-            <w:pPr>
-              <w:jc w:val="right"/>
-            </w:pPr>
-            <w:r>
-              <w:t>33.2%</w:t>
-            </w:r>
-          </w:p>
-        </w:tc>
-      </w:tr>
-      <w:tr>
-        <w:tc>
-          <w:tcPr>
-            <w:tcW w:type="dxa" w:w="1234"/>
-          </w:tcPr>
-          <w:p>
-            <w:r>
-              <w:t>Age of Mother</w:t>
-            </w:r>
-          </w:p>
-        </w:tc>
-        <w:tc>
-          <w:tcPr>
-            <w:tcW w:type="dxa" w:w="1234"/>
-          </w:tcPr>
-          <w:p>
-            <w:pPr>
-              <w:jc w:val="right"/>
-            </w:pPr>
-            <w:r>
-              <w:t>700,826</w:t>
-            </w:r>
-          </w:p>
-        </w:tc>
-        <w:tc>
-          <w:tcPr>
-            <w:tcW w:type="dxa" w:w="1234"/>
-          </w:tcPr>
-          <w:p>
-            <w:pPr>
-              <w:jc w:val="right"/>
-            </w:pPr>
-            <w:r>
-              <w:t>66.8%</w:t>
-            </w:r>
-          </w:p>
-        </w:tc>
-        <w:tc>
-          <w:tcPr>
-            <w:tcW w:type="dxa" w:w="1234"/>
-          </w:tcPr>
-          <w:p>
-            <w:r>
-              <w:t>float64</w:t>
-            </w:r>
-          </w:p>
-        </w:tc>
-        <w:tc>
-          <w:tcPr>
-            <w:tcW w:type="dxa" w:w="1234"/>
-          </w:tcPr>
-          <w:p>
-            <w:pPr>
-              <w:jc w:val="right"/>
-            </w:pPr>
-            <w:r>
-              <w:t>43</w:t>
-            </w:r>
-          </w:p>
-        </w:tc>
-        <w:tc>
-          <w:tcPr>
-            <w:tcW w:type="dxa" w:w="1234"/>
-          </w:tcPr>
-          <w:p>
-            <w:pPr>
-              <w:jc w:val="right"/>
-            </w:pPr>
-            <w:r>
-              <w:t>347,749</w:t>
-            </w:r>
-          </w:p>
-        </w:tc>
-        <w:tc>
-          <w:tcPr>
-            <w:tcW w:type="dxa" w:w="1234"/>
-          </w:tcPr>
-          <w:p>
-            <w:pPr>
-              <w:jc w:val="right"/>
-            </w:pPr>
-            <w:r>
-              <w:t>33.2%</w:t>
+              <w:t>100.0%</w:t>
             </w:r>
           </w:p>
         </w:tc>
@@ -1760,7 +890,7 @@
               <w:jc w:val="right"/>
             </w:pPr>
             <w:r>
-              <w:t>26</w:t>
+              <w:t>25</w:t>
             </w:r>
           </w:p>
         </w:tc>
@@ -1773,7 +903,877 @@
               <w:jc w:val="right"/>
             </w:pPr>
             <w:r>
-              <w:t>1,048,575</w:t>
+              <w:t>347,749</w:t>
+            </w:r>
+          </w:p>
+        </w:tc>
+        <w:tc>
+          <w:tcPr>
+            <w:tcW w:type="dxa" w:w="1234"/>
+          </w:tcPr>
+          <w:p>
+            <w:pPr>
+              <w:jc w:val="right"/>
+            </w:pPr>
+            <w:r>
+              <w:t>100.0%</w:t>
+            </w:r>
+          </w:p>
+        </w:tc>
+      </w:tr>
+      <w:tr>
+        <w:tc>
+          <w:tcPr>
+            <w:tcW w:type="dxa" w:w="1234"/>
+          </w:tcPr>
+          <w:p>
+            <w:r>
+              <w:t>Birh_Year_2.0</w:t>
+            </w:r>
+          </w:p>
+        </w:tc>
+        <w:tc>
+          <w:tcPr>
+            <w:tcW w:type="dxa" w:w="1234"/>
+          </w:tcPr>
+          <w:p>
+            <w:pPr>
+              <w:jc w:val="right"/>
+            </w:pPr>
+            <w:r>
+              <w:t>0</w:t>
+            </w:r>
+          </w:p>
+        </w:tc>
+        <w:tc>
+          <w:tcPr>
+            <w:tcW w:type="dxa" w:w="1234"/>
+          </w:tcPr>
+          <w:p>
+            <w:pPr>
+              <w:jc w:val="right"/>
+            </w:pPr>
+            <w:r>
+              <w:t>0.0%</w:t>
+            </w:r>
+          </w:p>
+        </w:tc>
+        <w:tc>
+          <w:tcPr>
+            <w:tcW w:type="dxa" w:w="1234"/>
+          </w:tcPr>
+          <w:p>
+            <w:r>
+              <w:t>int64</w:t>
+            </w:r>
+          </w:p>
+        </w:tc>
+        <w:tc>
+          <w:tcPr>
+            <w:tcW w:type="dxa" w:w="1234"/>
+          </w:tcPr>
+          <w:p>
+            <w:pPr>
+              <w:jc w:val="right"/>
+            </w:pPr>
+            <w:r>
+              <w:t>57</w:t>
+            </w:r>
+          </w:p>
+        </w:tc>
+        <w:tc>
+          <w:tcPr>
+            <w:tcW w:type="dxa" w:w="1234"/>
+          </w:tcPr>
+          <w:p>
+            <w:pPr>
+              <w:jc w:val="right"/>
+            </w:pPr>
+            <w:r>
+              <w:t>347,749</w:t>
+            </w:r>
+          </w:p>
+        </w:tc>
+        <w:tc>
+          <w:tcPr>
+            <w:tcW w:type="dxa" w:w="1234"/>
+          </w:tcPr>
+          <w:p>
+            <w:pPr>
+              <w:jc w:val="right"/>
+            </w:pPr>
+            <w:r>
+              <w:t>100.0%</w:t>
+            </w:r>
+          </w:p>
+        </w:tc>
+      </w:tr>
+      <w:tr>
+        <w:tc>
+          <w:tcPr>
+            <w:tcW w:type="dxa" w:w="1234"/>
+          </w:tcPr>
+          <w:p>
+            <w:r>
+              <w:t>Registered_Year</w:t>
+            </w:r>
+          </w:p>
+        </w:tc>
+        <w:tc>
+          <w:tcPr>
+            <w:tcW w:type="dxa" w:w="1234"/>
+          </w:tcPr>
+          <w:p>
+            <w:pPr>
+              <w:jc w:val="right"/>
+            </w:pPr>
+            <w:r>
+              <w:t>0</w:t>
+            </w:r>
+          </w:p>
+        </w:tc>
+        <w:tc>
+          <w:tcPr>
+            <w:tcW w:type="dxa" w:w="1234"/>
+          </w:tcPr>
+          <w:p>
+            <w:pPr>
+              <w:jc w:val="right"/>
+            </w:pPr>
+            <w:r>
+              <w:t>0.0%</w:t>
+            </w:r>
+          </w:p>
+        </w:tc>
+        <w:tc>
+          <w:tcPr>
+            <w:tcW w:type="dxa" w:w="1234"/>
+          </w:tcPr>
+          <w:p>
+            <w:r>
+              <w:t>int64</w:t>
+            </w:r>
+          </w:p>
+        </w:tc>
+        <w:tc>
+          <w:tcPr>
+            <w:tcW w:type="dxa" w:w="1234"/>
+          </w:tcPr>
+          <w:p>
+            <w:pPr>
+              <w:jc w:val="right"/>
+            </w:pPr>
+            <w:r>
+              <w:t>1</w:t>
+            </w:r>
+          </w:p>
+        </w:tc>
+        <w:tc>
+          <w:tcPr>
+            <w:tcW w:type="dxa" w:w="1234"/>
+          </w:tcPr>
+          <w:p>
+            <w:pPr>
+              <w:jc w:val="right"/>
+            </w:pPr>
+            <w:r>
+              <w:t>347,749</w:t>
+            </w:r>
+          </w:p>
+        </w:tc>
+        <w:tc>
+          <w:tcPr>
+            <w:tcW w:type="dxa" w:w="1234"/>
+          </w:tcPr>
+          <w:p>
+            <w:pPr>
+              <w:jc w:val="right"/>
+            </w:pPr>
+            <w:r>
+              <w:t>100.0%</w:t>
+            </w:r>
+          </w:p>
+        </w:tc>
+      </w:tr>
+      <w:tr>
+        <w:tc>
+          <w:tcPr>
+            <w:tcW w:type="dxa" w:w="1234"/>
+          </w:tcPr>
+          <w:p>
+            <w:r>
+              <w:t>Registered_Month</w:t>
+            </w:r>
+          </w:p>
+        </w:tc>
+        <w:tc>
+          <w:tcPr>
+            <w:tcW w:type="dxa" w:w="1234"/>
+          </w:tcPr>
+          <w:p>
+            <w:pPr>
+              <w:jc w:val="right"/>
+            </w:pPr>
+            <w:r>
+              <w:t>0</w:t>
+            </w:r>
+          </w:p>
+        </w:tc>
+        <w:tc>
+          <w:tcPr>
+            <w:tcW w:type="dxa" w:w="1234"/>
+          </w:tcPr>
+          <w:p>
+            <w:pPr>
+              <w:jc w:val="right"/>
+            </w:pPr>
+            <w:r>
+              <w:t>0.0%</w:t>
+            </w:r>
+          </w:p>
+        </w:tc>
+        <w:tc>
+          <w:tcPr>
+            <w:tcW w:type="dxa" w:w="1234"/>
+          </w:tcPr>
+          <w:p>
+            <w:r>
+              <w:t>str</w:t>
+            </w:r>
+          </w:p>
+        </w:tc>
+        <w:tc>
+          <w:tcPr>
+            <w:tcW w:type="dxa" w:w="1234"/>
+          </w:tcPr>
+          <w:p>
+            <w:pPr>
+              <w:jc w:val="right"/>
+            </w:pPr>
+            <w:r>
+              <w:t>12</w:t>
+            </w:r>
+          </w:p>
+        </w:tc>
+        <w:tc>
+          <w:tcPr>
+            <w:tcW w:type="dxa" w:w="1234"/>
+          </w:tcPr>
+          <w:p>
+            <w:pPr>
+              <w:jc w:val="right"/>
+            </w:pPr>
+            <w:r>
+              <w:t>347,749</w:t>
+            </w:r>
+          </w:p>
+        </w:tc>
+        <w:tc>
+          <w:tcPr>
+            <w:tcW w:type="dxa" w:w="1234"/>
+          </w:tcPr>
+          <w:p>
+            <w:pPr>
+              <w:jc w:val="right"/>
+            </w:pPr>
+            <w:r>
+              <w:t>100.0%</w:t>
+            </w:r>
+          </w:p>
+        </w:tc>
+      </w:tr>
+      <w:tr>
+        <w:tc>
+          <w:tcPr>
+            <w:tcW w:type="dxa" w:w="1234"/>
+          </w:tcPr>
+          <w:p>
+            <w:r>
+              <w:t>Birth_Month</w:t>
+            </w:r>
+          </w:p>
+        </w:tc>
+        <w:tc>
+          <w:tcPr>
+            <w:tcW w:type="dxa" w:w="1234"/>
+          </w:tcPr>
+          <w:p>
+            <w:pPr>
+              <w:jc w:val="right"/>
+            </w:pPr>
+            <w:r>
+              <w:t>0</w:t>
+            </w:r>
+          </w:p>
+        </w:tc>
+        <w:tc>
+          <w:tcPr>
+            <w:tcW w:type="dxa" w:w="1234"/>
+          </w:tcPr>
+          <w:p>
+            <w:pPr>
+              <w:jc w:val="right"/>
+            </w:pPr>
+            <w:r>
+              <w:t>0.0%</w:t>
+            </w:r>
+          </w:p>
+        </w:tc>
+        <w:tc>
+          <w:tcPr>
+            <w:tcW w:type="dxa" w:w="1234"/>
+          </w:tcPr>
+          <w:p>
+            <w:r>
+              <w:t>str</w:t>
+            </w:r>
+          </w:p>
+        </w:tc>
+        <w:tc>
+          <w:tcPr>
+            <w:tcW w:type="dxa" w:w="1234"/>
+          </w:tcPr>
+          <w:p>
+            <w:pPr>
+              <w:jc w:val="right"/>
+            </w:pPr>
+            <w:r>
+              <w:t>12</w:t>
+            </w:r>
+          </w:p>
+        </w:tc>
+        <w:tc>
+          <w:tcPr>
+            <w:tcW w:type="dxa" w:w="1234"/>
+          </w:tcPr>
+          <w:p>
+            <w:pPr>
+              <w:jc w:val="right"/>
+            </w:pPr>
+            <w:r>
+              <w:t>347,749</w:t>
+            </w:r>
+          </w:p>
+        </w:tc>
+        <w:tc>
+          <w:tcPr>
+            <w:tcW w:type="dxa" w:w="1234"/>
+          </w:tcPr>
+          <w:p>
+            <w:pPr>
+              <w:jc w:val="right"/>
+            </w:pPr>
+            <w:r>
+              <w:t>100.0%</w:t>
+            </w:r>
+          </w:p>
+        </w:tc>
+      </w:tr>
+      <w:tr>
+        <w:tc>
+          <w:tcPr>
+            <w:tcW w:type="dxa" w:w="1234"/>
+          </w:tcPr>
+          <w:p>
+            <w:r>
+              <w:t>Birh_Year</w:t>
+            </w:r>
+          </w:p>
+        </w:tc>
+        <w:tc>
+          <w:tcPr>
+            <w:tcW w:type="dxa" w:w="1234"/>
+          </w:tcPr>
+          <w:p>
+            <w:pPr>
+              <w:jc w:val="right"/>
+            </w:pPr>
+            <w:r>
+              <w:t>0</w:t>
+            </w:r>
+          </w:p>
+        </w:tc>
+        <w:tc>
+          <w:tcPr>
+            <w:tcW w:type="dxa" w:w="1234"/>
+          </w:tcPr>
+          <w:p>
+            <w:pPr>
+              <w:jc w:val="right"/>
+            </w:pPr>
+            <w:r>
+              <w:t>0.0%</w:t>
+            </w:r>
+          </w:p>
+        </w:tc>
+        <w:tc>
+          <w:tcPr>
+            <w:tcW w:type="dxa" w:w="1234"/>
+          </w:tcPr>
+          <w:p>
+            <w:r>
+              <w:t>int64</w:t>
+            </w:r>
+          </w:p>
+        </w:tc>
+        <w:tc>
+          <w:tcPr>
+            <w:tcW w:type="dxa" w:w="1234"/>
+          </w:tcPr>
+          <w:p>
+            <w:pPr>
+              <w:jc w:val="right"/>
+            </w:pPr>
+            <w:r>
+              <w:t>57</w:t>
+            </w:r>
+          </w:p>
+        </w:tc>
+        <w:tc>
+          <w:tcPr>
+            <w:tcW w:type="dxa" w:w="1234"/>
+          </w:tcPr>
+          <w:p>
+            <w:pPr>
+              <w:jc w:val="right"/>
+            </w:pPr>
+            <w:r>
+              <w:t>347,749</w:t>
+            </w:r>
+          </w:p>
+        </w:tc>
+        <w:tc>
+          <w:tcPr>
+            <w:tcW w:type="dxa" w:w="1234"/>
+          </w:tcPr>
+          <w:p>
+            <w:pPr>
+              <w:jc w:val="right"/>
+            </w:pPr>
+            <w:r>
+              <w:t>100.0%</w:t>
+            </w:r>
+          </w:p>
+        </w:tc>
+      </w:tr>
+      <w:tr>
+        <w:tc>
+          <w:tcPr>
+            <w:tcW w:type="dxa" w:w="1234"/>
+          </w:tcPr>
+          <w:p>
+            <w:r>
+              <w:t>Hospital or Not</w:t>
+            </w:r>
+          </w:p>
+        </w:tc>
+        <w:tc>
+          <w:tcPr>
+            <w:tcW w:type="dxa" w:w="1234"/>
+          </w:tcPr>
+          <w:p>
+            <w:pPr>
+              <w:jc w:val="right"/>
+            </w:pPr>
+            <w:r>
+              <w:t>0</w:t>
+            </w:r>
+          </w:p>
+        </w:tc>
+        <w:tc>
+          <w:tcPr>
+            <w:tcW w:type="dxa" w:w="1234"/>
+          </w:tcPr>
+          <w:p>
+            <w:pPr>
+              <w:jc w:val="right"/>
+            </w:pPr>
+            <w:r>
+              <w:t>0.0%</w:t>
+            </w:r>
+          </w:p>
+        </w:tc>
+        <w:tc>
+          <w:tcPr>
+            <w:tcW w:type="dxa" w:w="1234"/>
+          </w:tcPr>
+          <w:p>
+            <w:r>
+              <w:t>str</w:t>
+            </w:r>
+          </w:p>
+        </w:tc>
+        <w:tc>
+          <w:tcPr>
+            <w:tcW w:type="dxa" w:w="1234"/>
+          </w:tcPr>
+          <w:p>
+            <w:pPr>
+              <w:jc w:val="right"/>
+            </w:pPr>
+            <w:r>
+              <w:t>2</w:t>
+            </w:r>
+          </w:p>
+        </w:tc>
+        <w:tc>
+          <w:tcPr>
+            <w:tcW w:type="dxa" w:w="1234"/>
+          </w:tcPr>
+          <w:p>
+            <w:pPr>
+              <w:jc w:val="right"/>
+            </w:pPr>
+            <w:r>
+              <w:t>347,749</w:t>
+            </w:r>
+          </w:p>
+        </w:tc>
+        <w:tc>
+          <w:tcPr>
+            <w:tcW w:type="dxa" w:w="1234"/>
+          </w:tcPr>
+          <w:p>
+            <w:pPr>
+              <w:jc w:val="right"/>
+            </w:pPr>
+            <w:r>
+              <w:t>100.0%</w:t>
+            </w:r>
+          </w:p>
+        </w:tc>
+      </w:tr>
+      <w:tr>
+        <w:tc>
+          <w:tcPr>
+            <w:tcW w:type="dxa" w:w="1234"/>
+          </w:tcPr>
+          <w:p>
+            <w:r>
+              <w:t>Gender</w:t>
+            </w:r>
+          </w:p>
+        </w:tc>
+        <w:tc>
+          <w:tcPr>
+            <w:tcW w:type="dxa" w:w="1234"/>
+          </w:tcPr>
+          <w:p>
+            <w:pPr>
+              <w:jc w:val="right"/>
+            </w:pPr>
+            <w:r>
+              <w:t>0</w:t>
+            </w:r>
+          </w:p>
+        </w:tc>
+        <w:tc>
+          <w:tcPr>
+            <w:tcW w:type="dxa" w:w="1234"/>
+          </w:tcPr>
+          <w:p>
+            <w:pPr>
+              <w:jc w:val="right"/>
+            </w:pPr>
+            <w:r>
+              <w:t>0.0%</w:t>
+            </w:r>
+          </w:p>
+        </w:tc>
+        <w:tc>
+          <w:tcPr>
+            <w:tcW w:type="dxa" w:w="1234"/>
+          </w:tcPr>
+          <w:p>
+            <w:r>
+              <w:t>str</w:t>
+            </w:r>
+          </w:p>
+        </w:tc>
+        <w:tc>
+          <w:tcPr>
+            <w:tcW w:type="dxa" w:w="1234"/>
+          </w:tcPr>
+          <w:p>
+            <w:pPr>
+              <w:jc w:val="right"/>
+            </w:pPr>
+            <w:r>
+              <w:t>2</w:t>
+            </w:r>
+          </w:p>
+        </w:tc>
+        <w:tc>
+          <w:tcPr>
+            <w:tcW w:type="dxa" w:w="1234"/>
+          </w:tcPr>
+          <w:p>
+            <w:pPr>
+              <w:jc w:val="right"/>
+            </w:pPr>
+            <w:r>
+              <w:t>347,749</w:t>
+            </w:r>
+          </w:p>
+        </w:tc>
+        <w:tc>
+          <w:tcPr>
+            <w:tcW w:type="dxa" w:w="1234"/>
+          </w:tcPr>
+          <w:p>
+            <w:pPr>
+              <w:jc w:val="right"/>
+            </w:pPr>
+            <w:r>
+              <w:t>100.0%</w:t>
+            </w:r>
+          </w:p>
+        </w:tc>
+      </w:tr>
+      <w:tr>
+        <w:tc>
+          <w:tcPr>
+            <w:tcW w:type="dxa" w:w="1234"/>
+          </w:tcPr>
+          <w:p>
+            <w:r>
+              <w:t>Birth_Order 2.0</w:t>
+            </w:r>
+          </w:p>
+        </w:tc>
+        <w:tc>
+          <w:tcPr>
+            <w:tcW w:type="dxa" w:w="1234"/>
+          </w:tcPr>
+          <w:p>
+            <w:pPr>
+              <w:jc w:val="right"/>
+            </w:pPr>
+            <w:r>
+              <w:t>0</w:t>
+            </w:r>
+          </w:p>
+        </w:tc>
+        <w:tc>
+          <w:tcPr>
+            <w:tcW w:type="dxa" w:w="1234"/>
+          </w:tcPr>
+          <w:p>
+            <w:pPr>
+              <w:jc w:val="right"/>
+            </w:pPr>
+            <w:r>
+              <w:t>0.0%</w:t>
+            </w:r>
+          </w:p>
+        </w:tc>
+        <w:tc>
+          <w:tcPr>
+            <w:tcW w:type="dxa" w:w="1234"/>
+          </w:tcPr>
+          <w:p>
+            <w:r>
+              <w:t>int64</w:t>
+            </w:r>
+          </w:p>
+        </w:tc>
+        <w:tc>
+          <w:tcPr>
+            <w:tcW w:type="dxa" w:w="1234"/>
+          </w:tcPr>
+          <w:p>
+            <w:pPr>
+              <w:jc w:val="right"/>
+            </w:pPr>
+            <w:r>
+              <w:t>14</w:t>
+            </w:r>
+          </w:p>
+        </w:tc>
+        <w:tc>
+          <w:tcPr>
+            <w:tcW w:type="dxa" w:w="1234"/>
+          </w:tcPr>
+          <w:p>
+            <w:pPr>
+              <w:jc w:val="right"/>
+            </w:pPr>
+            <w:r>
+              <w:t>347,749</w:t>
+            </w:r>
+          </w:p>
+        </w:tc>
+        <w:tc>
+          <w:tcPr>
+            <w:tcW w:type="dxa" w:w="1234"/>
+          </w:tcPr>
+          <w:p>
+            <w:pPr>
+              <w:jc w:val="right"/>
+            </w:pPr>
+            <w:r>
+              <w:t>100.0%</w:t>
+            </w:r>
+          </w:p>
+        </w:tc>
+      </w:tr>
+      <w:tr>
+        <w:tc>
+          <w:tcPr>
+            <w:tcW w:type="dxa" w:w="1234"/>
+          </w:tcPr>
+          <w:p>
+            <w:r>
+              <w:t>Age of Mother</w:t>
+            </w:r>
+          </w:p>
+        </w:tc>
+        <w:tc>
+          <w:tcPr>
+            <w:tcW w:type="dxa" w:w="1234"/>
+          </w:tcPr>
+          <w:p>
+            <w:pPr>
+              <w:jc w:val="right"/>
+            </w:pPr>
+            <w:r>
+              <w:t>0</w:t>
+            </w:r>
+          </w:p>
+        </w:tc>
+        <w:tc>
+          <w:tcPr>
+            <w:tcW w:type="dxa" w:w="1234"/>
+          </w:tcPr>
+          <w:p>
+            <w:pPr>
+              <w:jc w:val="right"/>
+            </w:pPr>
+            <w:r>
+              <w:t>0.0%</w:t>
+            </w:r>
+          </w:p>
+        </w:tc>
+        <w:tc>
+          <w:tcPr>
+            <w:tcW w:type="dxa" w:w="1234"/>
+          </w:tcPr>
+          <w:p>
+            <w:r>
+              <w:t>int64</w:t>
+            </w:r>
+          </w:p>
+        </w:tc>
+        <w:tc>
+          <w:tcPr>
+            <w:tcW w:type="dxa" w:w="1234"/>
+          </w:tcPr>
+          <w:p>
+            <w:pPr>
+              <w:jc w:val="right"/>
+            </w:pPr>
+            <w:r>
+              <w:t>43</w:t>
+            </w:r>
+          </w:p>
+        </w:tc>
+        <w:tc>
+          <w:tcPr>
+            <w:tcW w:type="dxa" w:w="1234"/>
+          </w:tcPr>
+          <w:p>
+            <w:pPr>
+              <w:jc w:val="right"/>
+            </w:pPr>
+            <w:r>
+              <w:t>347,749</w:t>
+            </w:r>
+          </w:p>
+        </w:tc>
+        <w:tc>
+          <w:tcPr>
+            <w:tcW w:type="dxa" w:w="1234"/>
+          </w:tcPr>
+          <w:p>
+            <w:pPr>
+              <w:jc w:val="right"/>
+            </w:pPr>
+            <w:r>
+              <w:t>100.0%</w:t>
+            </w:r>
+          </w:p>
+        </w:tc>
+      </w:tr>
+      <w:tr>
+        <w:tc>
+          <w:tcPr>
+            <w:tcW w:type="dxa" w:w="1234"/>
+          </w:tcPr>
+          <w:p>
+            <w:r>
+              <w:t>Marital_Status</w:t>
+            </w:r>
+          </w:p>
+        </w:tc>
+        <w:tc>
+          <w:tcPr>
+            <w:tcW w:type="dxa" w:w="1234"/>
+          </w:tcPr>
+          <w:p>
+            <w:pPr>
+              <w:jc w:val="right"/>
+            </w:pPr>
+            <w:r>
+              <w:t>0</w:t>
+            </w:r>
+          </w:p>
+        </w:tc>
+        <w:tc>
+          <w:tcPr>
+            <w:tcW w:type="dxa" w:w="1234"/>
+          </w:tcPr>
+          <w:p>
+            <w:pPr>
+              <w:jc w:val="right"/>
+            </w:pPr>
+            <w:r>
+              <w:t>0.0%</w:t>
+            </w:r>
+          </w:p>
+        </w:tc>
+        <w:tc>
+          <w:tcPr>
+            <w:tcW w:type="dxa" w:w="1234"/>
+          </w:tcPr>
+          <w:p>
+            <w:r>
+              <w:t>str</w:t>
+            </w:r>
+          </w:p>
+        </w:tc>
+        <w:tc>
+          <w:tcPr>
+            <w:tcW w:type="dxa" w:w="1234"/>
+          </w:tcPr>
+          <w:p>
+            <w:pPr>
+              <w:jc w:val="right"/>
+            </w:pPr>
+            <w:r>
+              <w:t>2</w:t>
+            </w:r>
+          </w:p>
+        </w:tc>
+        <w:tc>
+          <w:tcPr>
+            <w:tcW w:type="dxa" w:w="1234"/>
+          </w:tcPr>
+          <w:p>
+            <w:pPr>
+              <w:jc w:val="right"/>
+            </w:pPr>
+            <w:r>
+              <w:t>347,749</w:t>
             </w:r>
           </w:p>
         </w:tc>
@@ -1860,7 +1860,7 @@
               <w:jc w:val="right"/>
             </w:pPr>
             <w:r>
-              <w:t>1,048,575</w:t>
+              <w:t>347,749</w:t>
             </w:r>
           </w:p>
         </w:tc>
@@ -2039,7 +2039,7 @@
       <w:jc w:val="center"/>
     </w:pPr>
     <w:r>
-      <w:t xml:space="preserve">Birth Records Data Quality Assessment | Generated: 2026-04-19 | Page </w:t>
+      <w:t xml:space="preserve">Birth Records Data Quality Assessment | Generated: 2026-04-24 | Page </w:t>
     </w:r>
     <w:r>
       <w:fldChar w:fldCharType="begin"/>

</xml_diff>

<commit_message>
creating complete data files 2000
</commit_message>
<xml_diff>
--- a/notebooks/2000_Birth/01_birth_records_quality_report.docx
+++ b/notebooks/2000_Birth/01_birth_records_quality_report.docx
@@ -13,12 +13,12 @@
     </w:p>
     <w:p>
       <w:r>
-        <w:t>Generated: 2026-04-24 06:21</w:t>
+        <w:t>Generated: 2026-04-30 18:09</w:t>
       </w:r>
     </w:p>
     <w:p>
       <w:r>
-        <w:t>Dataset: 347,749 birth records × 14 variables</w:t>
+        <w:t>Dataset: 347,738 birth records × 14 variables</w:t>
       </w:r>
     </w:p>
     <w:p/>
@@ -37,13 +37,13 @@
         <w:t>Key findings include:</w:t>
         <w:br/>
         <w:br/>
-        <w:t>• **Dataset Overview**: 347,749 total birth records with 14 variables</w:t>
+        <w:t>• **Dataset Overview**: 347,738 total birth records with 14 variables</w:t>
         <w:br/>
-        <w:t>• **Data Completeness**: 347,437 records (99.9%) are completely filled with no missing values</w:t>
+        <w:t>• **Data Completeness**: 347,429 records (99.9%) are completely filled with no missing values</w:t>
         <w:br/>
-        <w:t>• **Records with Missing Data**: 312 records (0.1%) contain at least one missing value</w:t>
+        <w:t>• **Records with Missing Data**: 309 records (0.1%) contain at least one missing value</w:t>
         <w:br/>
-        <w:t>• **Total Missing Values**: 312 missing values across all variables (0.01% of all data)</w:t>
+        <w:t>• **Total Missing Values**: 309 missing values across all variables (0.01% of all data)</w:t>
         <w:br/>
         <w:t>• **Average Completeness**: Each record has an average of 0.0 missing values</w:t>
         <w:br/>
@@ -127,7 +127,7 @@
               <w:jc w:val="right"/>
             </w:pPr>
             <w:r>
-              <w:t>347749.0</w:t>
+              <w:t>347738.0</w:t>
             </w:r>
           </w:p>
         </w:tc>
@@ -202,7 +202,7 @@
               <w:jc w:val="right"/>
             </w:pPr>
             <w:r>
-              <w:t>312.0</w:t>
+              <w:t>309.0</w:t>
             </w:r>
           </w:p>
         </w:tc>
@@ -252,7 +252,7 @@
               <w:jc w:val="right"/>
             </w:pPr>
             <w:r>
-              <w:t>347437.0</w:t>
+              <w:t>347429.0</w:t>
             </w:r>
           </w:p>
         </w:tc>
@@ -277,7 +277,7 @@
               <w:jc w:val="right"/>
             </w:pPr>
             <w:r>
-              <w:t>312.0</w:t>
+              <w:t>309.0</w:t>
             </w:r>
           </w:p>
         </w:tc>
@@ -393,7 +393,7 @@
     </w:p>
     <w:p>
       <w:r>
-        <w:t>Found 347,437 completely filled birth records (99.9% of total). These records can be used for immediate analysis without imputation.</w:t>
+        <w:t>Found 347,429 completely filled birth records (99.9% of total). These records can be used for immediate analysis without imputation.</w:t>
       </w:r>
     </w:p>
     <w:p>
@@ -411,7 +411,7 @@
     </w:p>
     <w:p>
       <w:r>
-        <w:t>Found 312 records with at least one missing value (0.1% of total). These records require data imputation or careful handling in analysis.</w:t>
+        <w:t>Found 309 records with at least one missing value (0.1% of total). These records require data imputation or careful handling in analysis.</w:t>
       </w:r>
     </w:p>
     <w:p>
@@ -729,7 +729,7 @@
               <w:jc w:val="right"/>
             </w:pPr>
             <w:r>
-              <w:t>347,528</w:t>
+              <w:t>347,517</w:t>
             </w:r>
           </w:p>
         </w:tc>
@@ -767,7 +767,7 @@
               <w:jc w:val="right"/>
             </w:pPr>
             <w:r>
-              <w:t>91</w:t>
+              <w:t>88</w:t>
             </w:r>
           </w:p>
         </w:tc>
@@ -816,7 +816,7 @@
               <w:jc w:val="right"/>
             </w:pPr>
             <w:r>
-              <w:t>347,658</w:t>
+              <w:t>347,650</w:t>
             </w:r>
           </w:p>
         </w:tc>
@@ -903,7 +903,7 @@
               <w:jc w:val="right"/>
             </w:pPr>
             <w:r>
-              <w:t>347,749</w:t>
+              <w:t>347,738</w:t>
             </w:r>
           </w:p>
         </w:tc>
@@ -990,7 +990,7 @@
               <w:jc w:val="right"/>
             </w:pPr>
             <w:r>
-              <w:t>347,749</w:t>
+              <w:t>347,738</w:t>
             </w:r>
           </w:p>
         </w:tc>
@@ -1077,7 +1077,7 @@
               <w:jc w:val="right"/>
             </w:pPr>
             <w:r>
-              <w:t>347,749</w:t>
+              <w:t>347,738</w:t>
             </w:r>
           </w:p>
         </w:tc>
@@ -1164,7 +1164,7 @@
               <w:jc w:val="right"/>
             </w:pPr>
             <w:r>
-              <w:t>347,749</w:t>
+              <w:t>347,738</w:t>
             </w:r>
           </w:p>
         </w:tc>
@@ -1251,7 +1251,7 @@
               <w:jc w:val="right"/>
             </w:pPr>
             <w:r>
-              <w:t>347,749</w:t>
+              <w:t>347,738</w:t>
             </w:r>
           </w:p>
         </w:tc>
@@ -1338,7 +1338,7 @@
               <w:jc w:val="right"/>
             </w:pPr>
             <w:r>
-              <w:t>347,749</w:t>
+              <w:t>347,738</w:t>
             </w:r>
           </w:p>
         </w:tc>
@@ -1425,7 +1425,7 @@
               <w:jc w:val="right"/>
             </w:pPr>
             <w:r>
-              <w:t>347,749</w:t>
+              <w:t>347,738</w:t>
             </w:r>
           </w:p>
         </w:tc>
@@ -1512,7 +1512,7 @@
               <w:jc w:val="right"/>
             </w:pPr>
             <w:r>
-              <w:t>347,749</w:t>
+              <w:t>347,738</w:t>
             </w:r>
           </w:p>
         </w:tc>
@@ -1599,7 +1599,7 @@
               <w:jc w:val="right"/>
             </w:pPr>
             <w:r>
-              <w:t>347,749</w:t>
+              <w:t>347,738</w:t>
             </w:r>
           </w:p>
         </w:tc>
@@ -1686,7 +1686,7 @@
               <w:jc w:val="right"/>
             </w:pPr>
             <w:r>
-              <w:t>347,749</w:t>
+              <w:t>347,738</w:t>
             </w:r>
           </w:p>
         </w:tc>
@@ -1773,7 +1773,7 @@
               <w:jc w:val="right"/>
             </w:pPr>
             <w:r>
-              <w:t>347,749</w:t>
+              <w:t>347,738</w:t>
             </w:r>
           </w:p>
         </w:tc>
@@ -1847,7 +1847,7 @@
               <w:jc w:val="right"/>
             </w:pPr>
             <w:r>
-              <w:t>26</w:t>
+              <w:t>25</w:t>
             </w:r>
           </w:p>
         </w:tc>
@@ -1860,7 +1860,7 @@
               <w:jc w:val="right"/>
             </w:pPr>
             <w:r>
-              <w:t>347,749</w:t>
+              <w:t>347,738</w:t>
             </w:r>
           </w:p>
         </w:tc>
@@ -1900,7 +1900,7 @@
         <w:pStyle w:val="ListBullet"/>
       </w:pPr>
       <w:r>
-        <w:t>Use the 347,437 complete records for immediate analysis where possible</w:t>
+        <w:t>Use the 347,429 complete records for immediate analysis where possible</w:t>
       </w:r>
     </w:p>
     <w:p>
@@ -2039,7 +2039,7 @@
       <w:jc w:val="center"/>
     </w:pPr>
     <w:r>
-      <w:t xml:space="preserve">Birth Records Data Quality Assessment | Generated: 2026-04-24 | Page </w:t>
+      <w:t xml:space="preserve">Birth Records Data Quality Assessment | Generated: 2026-04-30 | Page </w:t>
     </w:r>
     <w:r>
       <w:fldChar w:fldCharType="begin"/>

</xml_diff>